<commit_message>
Added caching and replaced HR_POLICIES data
</commit_message>
<xml_diff>
--- a/data/hr_docs/NPAX_POLICIES.docx
+++ b/data/hr_docs/NPAX_POLICIES.docx
@@ -145,7 +145,13 @@
         </w:numPr>
       </w:pPr>
       <w:r>
-        <w:t>Login to HRConnect → Go to Leave Management → Click “File Leave” → Select type, dates, and reason → Submit.</w:t>
+        <w:t xml:space="preserve">Login to HRConnect → Go to Leave Management → Click “File Leave” → Select type, </w:t>
+      </w:r>
+      <w:r>
+        <w:t>Number of Days</w:t>
+      </w:r>
+      <w:r>
+        <w:t>, and reason → Submit.</w:t>
       </w:r>
     </w:p>
     <w:p>
@@ -2466,23 +2472,105 @@
         <w:pStyle w:val="ListParagraph"/>
         <w:numPr>
           <w:ilvl w:val="0"/>
-          <w:numId w:val="13"/>
-        </w:numPr>
-      </w:pPr>
-      <w:r>
+          <w:numId w:val="29"/>
+        </w:numPr>
+      </w:pPr>
+      <w:r>
+        <w:rPr>
+          <w:color w:val="EE0000"/>
+        </w:rPr>
         <w:t>What’s the payroll schedule and cutoff</w:t>
       </w:r>
+      <w:r>
+        <w:rPr>
+          <w:color w:val="EE0000"/>
+        </w:rPr>
+        <w:br/>
+      </w:r>
+      <w:r>
+        <w:t xml:space="preserve">Ans:  </w:t>
+      </w:r>
+      <w:r>
+        <w:t xml:space="preserve">Payroll is processed </w:t>
+      </w:r>
+      <w:r>
+        <w:rPr>
+          <w:b/>
+          <w:bCs/>
+        </w:rPr>
+        <w:t>bi-monthly</w:t>
+      </w:r>
+      <w:r>
+        <w:t>.</w:t>
+      </w:r>
     </w:p>
     <w:p>
       <w:pPr>
         <w:pStyle w:val="ListParagraph"/>
         <w:numPr>
           <w:ilvl w:val="0"/>
-          <w:numId w:val="13"/>
-        </w:numPr>
-        <w:rPr>
-          <w:color w:val="EE0000"/>
-        </w:rPr>
+          <w:numId w:val="28"/>
+        </w:numPr>
+      </w:pPr>
+      <w:r>
+        <w:rPr>
+          <w:b/>
+          <w:bCs/>
+        </w:rPr>
+        <w:t>Cutoff:</w:t>
+      </w:r>
+      <w:r>
+        <w:t xml:space="preserve"> 1st–15th and 16th–30th/31st of the month</w:t>
+      </w:r>
+    </w:p>
+    <w:p>
+      <w:pPr>
+        <w:pStyle w:val="ListParagraph"/>
+        <w:numPr>
+          <w:ilvl w:val="0"/>
+          <w:numId w:val="28"/>
+        </w:numPr>
+      </w:pPr>
+      <w:r>
+        <w:rPr>
+          <w:b/>
+          <w:bCs/>
+        </w:rPr>
+        <w:t>Payout:</w:t>
+      </w:r>
+      <w:r>
+        <w:t xml:space="preserve"> Typically released </w:t>
+      </w:r>
+      <w:r>
+        <w:rPr>
+          <w:b/>
+          <w:bCs/>
+        </w:rPr>
+        <w:t>every 15th and 30th/</w:t>
+      </w:r>
+      <w:proofErr w:type="gramStart"/>
+      <w:r>
+        <w:rPr>
+          <w:b/>
+          <w:bCs/>
+        </w:rPr>
+        <w:t>31st</w:t>
+      </w:r>
+      <w:r>
+        <w:t>, or</w:t>
+      </w:r>
+      <w:proofErr w:type="gramEnd"/>
+      <w:r>
+        <w:t xml:space="preserve"> based on the company payroll calendar.</w:t>
+      </w:r>
+    </w:p>
+    <w:p>
+      <w:pPr>
+        <w:pStyle w:val="ListParagraph"/>
+        <w:numPr>
+          <w:ilvl w:val="0"/>
+          <w:numId w:val="29"/>
+        </w:numPr>
       </w:pPr>
       <w:r>
         <w:rPr>
@@ -2490,13 +2578,49 @@
         </w:rPr>
         <w:t>What’s the policy on overtime pay and night differential?</w:t>
       </w:r>
+      <w:r>
+        <w:rPr>
+          <w:color w:val="EE0000"/>
+        </w:rPr>
+        <w:br/>
+      </w:r>
+      <w:r>
+        <w:t xml:space="preserve">Ans: </w:t>
+      </w:r>
+      <w:r>
+        <w:t>Overtime requires prior approval from your Department Head and must be filed through your workflow access.</w:t>
+      </w:r>
+      <w:r>
+        <w:br/>
+        <w:t xml:space="preserve">Night Differential applies from </w:t>
+      </w:r>
+      <w:r>
+        <w:rPr>
+          <w:b/>
+          <w:bCs/>
+        </w:rPr>
+        <w:t>10:00 PM to 6:00 AM</w:t>
+      </w:r>
+      <w:r>
+        <w:t xml:space="preserve">, with an additional </w:t>
+      </w:r>
+      <w:r>
+        <w:rPr>
+          <w:b/>
+          <w:bCs/>
+        </w:rPr>
+        <w:t>12.5%</w:t>
+      </w:r>
+      <w:r>
+        <w:t xml:space="preserve"> of the employee’s daily rate.</w:t>
+      </w:r>
     </w:p>
     <w:p>
       <w:pPr>
         <w:pStyle w:val="ListParagraph"/>
         <w:numPr>
           <w:ilvl w:val="0"/>
-          <w:numId w:val="13"/>
+          <w:numId w:val="29"/>
         </w:numPr>
         <w:rPr>
           <w:color w:val="EE0000"/>
@@ -2507,6 +2631,32 @@
           <w:color w:val="EE0000"/>
         </w:rPr>
         <w:t>What’s the process for payroll disputes or errors?</w:t>
+      </w:r>
+      <w:r>
+        <w:rPr>
+          <w:color w:val="EE0000"/>
+        </w:rPr>
+        <w:br/>
+      </w:r>
+      <w:r>
+        <w:rPr>
+          <w:color w:val="000000" w:themeColor="text1"/>
+        </w:rPr>
+        <w:t xml:space="preserve">Ans: Any payroll discrepancies should be reported to HR immediately. Adjustments or corrections will be reflected in the </w:t>
+      </w:r>
+      <w:r>
+        <w:rPr>
+          <w:b/>
+          <w:bCs/>
+          <w:color w:val="000000" w:themeColor="text1"/>
+        </w:rPr>
+        <w:t>next payroll cycle</w:t>
+      </w:r>
+      <w:r>
+        <w:rPr>
+          <w:color w:val="000000" w:themeColor="text1"/>
+        </w:rPr>
+        <w:t>.</w:t>
       </w:r>
     </w:p>
     <w:p>
@@ -2659,6 +2809,7 @@
           <w:sz w:val="36"/>
           <w:szCs w:val="36"/>
         </w:rPr>
+        <w:lastRenderedPageBreak/>
         <w:t>Leave Management Policies</w:t>
       </w:r>
       <w:r>
@@ -2677,9 +2828,6 @@
           <w:ilvl w:val="0"/>
           <w:numId w:val="14"/>
         </w:numPr>
-        <w:rPr>
-          <w:color w:val="EE0000"/>
-        </w:rPr>
       </w:pPr>
       <w:r>
         <w:rPr>
@@ -2687,6 +2835,31 @@
         </w:rPr>
         <w:t>What are the company’s vacation and sick leave entitlements?</w:t>
       </w:r>
+      <w:r>
+        <w:rPr>
+          <w:color w:val="EE0000"/>
+        </w:rPr>
+        <w:br/>
+      </w:r>
+      <w:r>
+        <w:t>Ans:</w:t>
+      </w:r>
+      <w:r>
+        <w:t xml:space="preserve"> </w:t>
+      </w:r>
+      <w:r>
+        <w:t xml:space="preserve">Employees are entitled to </w:t>
+      </w:r>
+      <w:r>
+        <w:rPr>
+          <w:b/>
+          <w:bCs/>
+        </w:rPr>
+        <w:t>annual vacation and sick leave credits</w:t>
+      </w:r>
+      <w:r>
+        <w:t xml:space="preserve"> as stated in the company policy. Leave credits may vary depending on employment status and length of service.</w:t>
+      </w:r>
     </w:p>
     <w:p>
       <w:pPr>
@@ -2705,6 +2878,31 @@
         </w:rPr>
         <w:t>What’s the rule for filing emergency leave?</w:t>
       </w:r>
+      <w:r>
+        <w:rPr>
+          <w:color w:val="EE0000"/>
+        </w:rPr>
+        <w:br/>
+      </w:r>
+      <w:r>
+        <w:t>Ans:</w:t>
+      </w:r>
+      <w:r>
+        <w:t xml:space="preserve"> </w:t>
+      </w:r>
+      <w:r>
+        <w:t xml:space="preserve">Emergency leave should be filed </w:t>
+      </w:r>
+      <w:r>
+        <w:rPr>
+          <w:b/>
+          <w:bCs/>
+        </w:rPr>
+        <w:t>as soon as possible</w:t>
+      </w:r>
+      <w:r>
+        <w:t xml:space="preserve"> through the workflow system and must include a brief explanation. Approval is still subject to the supervisor or Department Head.</w:t>
+      </w:r>
     </w:p>
     <w:p>
       <w:pPr>
@@ -2713,21 +2911,45 @@
           <w:ilvl w:val="0"/>
           <w:numId w:val="14"/>
         </w:numPr>
+        <w:rPr>
+          <w:color w:val="EE0000"/>
+        </w:rPr>
       </w:pPr>
       <w:r>
         <w:t>Can probationary employees file leave?</w:t>
       </w:r>
+      <w:r>
+        <w:br/>
+      </w:r>
+      <w:r>
+        <w:t xml:space="preserve">Ans: </w:t>
+      </w:r>
+      <w:r>
+        <w:t xml:space="preserve">Yes. Probationary employees may file leave </w:t>
+      </w:r>
+      <w:r>
+        <w:rPr>
+          <w:b/>
+          <w:bCs/>
+        </w:rPr>
+        <w:t>once they have earned or accrued leave credits</w:t>
+      </w:r>
+      <w:r>
+        <w:t>, subject to company policy.</w:t>
+      </w:r>
     </w:p>
     <w:p>
       <w:pPr>
         <w:pStyle w:val="ListParagraph"/>
+      </w:pPr>
+    </w:p>
+    <w:p>
+      <w:pPr>
+        <w:pStyle w:val="ListParagraph"/>
         <w:numPr>
           <w:ilvl w:val="0"/>
           <w:numId w:val="14"/>
         </w:numPr>
-        <w:rPr>
-          <w:color w:val="EE0000"/>
-        </w:rPr>
       </w:pPr>
       <w:r>
         <w:rPr>
@@ -2735,6 +2957,76 @@
         </w:rPr>
         <w:t>What’s the policy for holiday leaves?</w:t>
       </w:r>
+      <w:r>
+        <w:rPr>
+          <w:color w:val="EE0000"/>
+        </w:rPr>
+        <w:br/>
+      </w:r>
+      <w:r>
+        <w:t>Ans:</w:t>
+      </w:r>
+      <w:r>
+        <w:rPr>
+          <w:rFonts w:ascii="Times New Roman" w:eastAsia="Times New Roman" w:hAnsi="Symbol" w:cs="Times New Roman"/>
+          <w:kern w:val="0"/>
+          <w:lang w:eastAsia="en-PH"/>
+          <w14:ligatures w14:val="none"/>
+        </w:rPr>
+        <w:t xml:space="preserve"> </w:t>
+      </w:r>
+      <w:r>
+        <w:rPr>
+          <w:b/>
+          <w:bCs/>
+        </w:rPr>
+        <w:t>Regular Holidays:</w:t>
+      </w:r>
+      <w:r>
+        <w:t xml:space="preserve"> Employees who report to work are entitled to </w:t>
+      </w:r>
+      <w:r>
+        <w:rPr>
+          <w:b/>
+          <w:bCs/>
+        </w:rPr>
+        <w:t>double pay</w:t>
+      </w:r>
+      <w:r>
+        <w:t>.</w:t>
+      </w:r>
+    </w:p>
+    <w:p>
+      <w:pPr>
+        <w:pStyle w:val="ListParagraph"/>
+      </w:pPr>
+      <w:r>
+        <w:rPr>
+          <w:b/>
+          <w:bCs/>
+        </w:rPr>
+        <w:t>Special Holidays:</w:t>
+      </w:r>
+      <w:r>
+        <w:t xml:space="preserve"> Employees who report to work receive an additional </w:t>
+      </w:r>
+      <w:r>
+        <w:rPr>
+          <w:b/>
+          <w:bCs/>
+        </w:rPr>
+        <w:t>30%</w:t>
+      </w:r>
+      <w:r>
+        <w:t xml:space="preserve"> of their daily rate.</w:t>
+      </w:r>
+    </w:p>
+    <w:p>
+      <w:pPr>
+        <w:rPr>
+          <w:color w:val="EE0000"/>
+        </w:rPr>
+      </w:pPr>
     </w:p>
     <w:p>
       <w:pPr>
@@ -2816,7 +3108,6 @@
           <w:bCs/>
           <w:color w:val="EE0000"/>
         </w:rPr>
-        <w:lastRenderedPageBreak/>
         <w:t>What’s the rule for filing emergency leave?</w:t>
       </w:r>
     </w:p>
@@ -2946,6 +3237,25 @@
       <w:r>
         <w:t>How should employees log their attendance</w:t>
       </w:r>
+      <w:r>
+        <w:br/>
+      </w:r>
+      <w:r>
+        <w:t xml:space="preserve">Ans: </w:t>
+      </w:r>
+      <w:r>
+        <w:t xml:space="preserve">Employees must log their attendance using the </w:t>
+      </w:r>
+      <w:r>
+        <w:rPr>
+          <w:b/>
+          <w:bCs/>
+        </w:rPr>
+        <w:t>official timekeeping system</w:t>
+      </w:r>
+      <w:r>
+        <w:t>, such as biometrics, mobile app, or web portal, depending on company setup.</w:t>
+      </w:r>
     </w:p>
     <w:p>
       <w:pPr>
@@ -2958,6 +3268,35 @@
       <w:r>
         <w:t>What’s the official work schedule and grace period for attendance?</w:t>
       </w:r>
+      <w:r>
+        <w:br/>
+      </w:r>
+      <w:r>
+        <w:t xml:space="preserve">Ans: </w:t>
+      </w:r>
+      <w:r>
+        <w:t xml:space="preserve">The standard work schedule is </w:t>
+      </w:r>
+      <w:r>
+        <w:rPr>
+          <w:b/>
+          <w:bCs/>
+        </w:rPr>
+        <w:t>8 hours per day</w:t>
+      </w:r>
+      <w:r>
+        <w:t xml:space="preserve">, not including breaks. A </w:t>
+      </w:r>
+      <w:r>
+        <w:rPr>
+          <w:b/>
+          <w:bCs/>
+        </w:rPr>
+        <w:t>grace period</w:t>
+      </w:r>
+      <w:r>
+        <w:t xml:space="preserve"> (usually 5–15 minutes) may be provided based on company policy, though repeated tardiness may still be subject to disciplinary action.</w:t>
+      </w:r>
     </w:p>
     <w:p>
       <w:pPr>
@@ -2968,8 +3307,28 @@
         </w:numPr>
       </w:pPr>
       <w:r>
+        <w:lastRenderedPageBreak/>
         <w:t>What’s the process if I forget to time-in or time-out?</w:t>
       </w:r>
+      <w:r>
+        <w:br/>
+      </w:r>
+      <w:r>
+        <w:t xml:space="preserve">Ans: </w:t>
+      </w:r>
+      <w:r>
+        <w:t xml:space="preserve">Employees must file a </w:t>
+      </w:r>
+      <w:r>
+        <w:rPr>
+          <w:b/>
+          <w:bCs/>
+        </w:rPr>
+        <w:t>Time Correction Request</w:t>
+      </w:r>
+      <w:r>
+        <w:t xml:space="preserve"> through their workflow access, stating the reason. Approval from the immediate supervisor or Department Head is required.</w:t>
+      </w:r>
     </w:p>
     <w:p>
       <w:pPr>
@@ -2982,6 +3341,15 @@
       <w:r>
         <w:t>What’s the policy for missing time logs?</w:t>
       </w:r>
+      <w:r>
+        <w:br/>
+      </w:r>
+      <w:r>
+        <w:t xml:space="preserve">Ans: </w:t>
+      </w:r>
+      <w:r>
+        <w:t>Missing logs must be corrected through the timekeeping system. Frequent missing logs may be subject to investigation or corrective action depending on HR policy.</w:t>
+      </w:r>
     </w:p>
     <w:p>
       <w:pPr>
@@ -2997,6 +3365,38 @@
         </w:rPr>
         <w:t>How are absences handled and when are they considered unexcused?</w:t>
       </w:r>
+      <w:r>
+        <w:rPr>
+          <w:color w:val="EE0000"/>
+        </w:rPr>
+        <w:br/>
+      </w:r>
+      <w:r>
+        <w:t xml:space="preserve">Ans: </w:t>
+      </w:r>
+      <w:r>
+        <w:t xml:space="preserve">An absence is considered </w:t>
+      </w:r>
+      <w:r>
+        <w:rPr>
+          <w:b/>
+          <w:bCs/>
+        </w:rPr>
+        <w:t>unexcused</w:t>
+      </w:r>
+      <w:r>
+        <w:t xml:space="preserve"> if the employee fails to provide a valid reason or documentation within the required timeframe. Absences of </w:t>
+      </w:r>
+      <w:r>
+        <w:rPr>
+          <w:b/>
+          <w:bCs/>
+        </w:rPr>
+        <w:t>three (3) consecutive days or more</w:t>
+      </w:r>
+      <w:r>
+        <w:t xml:space="preserve"> without notice may be treated as job abandonment.</w:t>
+      </w:r>
     </w:p>
     <w:p>
       <w:pPr>
@@ -3005,9 +3405,6 @@
           <w:ilvl w:val="0"/>
           <w:numId w:val="15"/>
         </w:numPr>
-        <w:rPr>
-          <w:color w:val="EE0000"/>
-        </w:rPr>
       </w:pPr>
       <w:r>
         <w:rPr>
@@ -3015,6 +3412,26 @@
         </w:rPr>
         <w:t>What’s the rule for time correction or adjustment requests?</w:t>
       </w:r>
+      <w:r>
+        <w:rPr>
+          <w:color w:val="EE0000"/>
+        </w:rPr>
+        <w:br/>
+      </w:r>
+      <w:r>
+        <w:t>Ans:</w:t>
+      </w:r>
+      <w:r>
+        <w:t xml:space="preserve"> Time corrections may be filed through the employee’s workflow access and must be approved by their designated approver or Department Head.</w:t>
+      </w:r>
+    </w:p>
+    <w:p>
+      <w:pPr>
+        <w:pStyle w:val="ListParagraph"/>
+        <w:rPr>
+          <w:color w:val="EE0000"/>
+        </w:rPr>
+      </w:pPr>
     </w:p>
     <w:p>
       <w:pPr>
@@ -4122,6 +4539,155 @@
     </w:lvl>
   </w:abstractNum>
   <w:abstractNum w:abstractNumId="9" w15:restartNumberingAfterBreak="0">
+    <w:nsid w:val="2F921DB8"/>
+    <w:multiLevelType w:val="multilevel"/>
+    <w:tmpl w:val="82AC9996"/>
+    <w:lvl w:ilvl="0">
+      <w:start w:val="1"/>
+      <w:numFmt w:val="bullet"/>
+      <w:lvlText w:val=""/>
+      <w:lvlJc w:val="left"/>
+      <w:pPr>
+        <w:tabs>
+          <w:tab w:val="num" w:pos="720"/>
+        </w:tabs>
+        <w:ind w:left="720" w:hanging="360"/>
+      </w:pPr>
+      <w:rPr>
+        <w:rFonts w:ascii="Symbol" w:hAnsi="Symbol" w:hint="default"/>
+        <w:sz w:val="20"/>
+      </w:rPr>
+    </w:lvl>
+    <w:lvl w:ilvl="1" w:tentative="1">
+      <w:start w:val="1"/>
+      <w:numFmt w:val="bullet"/>
+      <w:lvlText w:val="o"/>
+      <w:lvlJc w:val="left"/>
+      <w:pPr>
+        <w:tabs>
+          <w:tab w:val="num" w:pos="1440"/>
+        </w:tabs>
+        <w:ind w:left="1440" w:hanging="360"/>
+      </w:pPr>
+      <w:rPr>
+        <w:rFonts w:ascii="Courier New" w:hAnsi="Courier New" w:hint="default"/>
+        <w:sz w:val="20"/>
+      </w:rPr>
+    </w:lvl>
+    <w:lvl w:ilvl="2" w:tentative="1">
+      <w:start w:val="1"/>
+      <w:numFmt w:val="bullet"/>
+      <w:lvlText w:val=""/>
+      <w:lvlJc w:val="left"/>
+      <w:pPr>
+        <w:tabs>
+          <w:tab w:val="num" w:pos="2160"/>
+        </w:tabs>
+        <w:ind w:left="2160" w:hanging="360"/>
+      </w:pPr>
+      <w:rPr>
+        <w:rFonts w:ascii="Wingdings" w:hAnsi="Wingdings" w:hint="default"/>
+        <w:sz w:val="20"/>
+      </w:rPr>
+    </w:lvl>
+    <w:lvl w:ilvl="3" w:tentative="1">
+      <w:start w:val="1"/>
+      <w:numFmt w:val="bullet"/>
+      <w:lvlText w:val=""/>
+      <w:lvlJc w:val="left"/>
+      <w:pPr>
+        <w:tabs>
+          <w:tab w:val="num" w:pos="2880"/>
+        </w:tabs>
+        <w:ind w:left="2880" w:hanging="360"/>
+      </w:pPr>
+      <w:rPr>
+        <w:rFonts w:ascii="Wingdings" w:hAnsi="Wingdings" w:hint="default"/>
+        <w:sz w:val="20"/>
+      </w:rPr>
+    </w:lvl>
+    <w:lvl w:ilvl="4" w:tentative="1">
+      <w:start w:val="1"/>
+      <w:numFmt w:val="bullet"/>
+      <w:lvlText w:val=""/>
+      <w:lvlJc w:val="left"/>
+      <w:pPr>
+        <w:tabs>
+          <w:tab w:val="num" w:pos="3600"/>
+        </w:tabs>
+        <w:ind w:left="3600" w:hanging="360"/>
+      </w:pPr>
+      <w:rPr>
+        <w:rFonts w:ascii="Wingdings" w:hAnsi="Wingdings" w:hint="default"/>
+        <w:sz w:val="20"/>
+      </w:rPr>
+    </w:lvl>
+    <w:lvl w:ilvl="5" w:tentative="1">
+      <w:start w:val="1"/>
+      <w:numFmt w:val="bullet"/>
+      <w:lvlText w:val=""/>
+      <w:lvlJc w:val="left"/>
+      <w:pPr>
+        <w:tabs>
+          <w:tab w:val="num" w:pos="4320"/>
+        </w:tabs>
+        <w:ind w:left="4320" w:hanging="360"/>
+      </w:pPr>
+      <w:rPr>
+        <w:rFonts w:ascii="Wingdings" w:hAnsi="Wingdings" w:hint="default"/>
+        <w:sz w:val="20"/>
+      </w:rPr>
+    </w:lvl>
+    <w:lvl w:ilvl="6" w:tentative="1">
+      <w:start w:val="1"/>
+      <w:numFmt w:val="bullet"/>
+      <w:lvlText w:val=""/>
+      <w:lvlJc w:val="left"/>
+      <w:pPr>
+        <w:tabs>
+          <w:tab w:val="num" w:pos="5040"/>
+        </w:tabs>
+        <w:ind w:left="5040" w:hanging="360"/>
+      </w:pPr>
+      <w:rPr>
+        <w:rFonts w:ascii="Wingdings" w:hAnsi="Wingdings" w:hint="default"/>
+        <w:sz w:val="20"/>
+      </w:rPr>
+    </w:lvl>
+    <w:lvl w:ilvl="7" w:tentative="1">
+      <w:start w:val="1"/>
+      <w:numFmt w:val="bullet"/>
+      <w:lvlText w:val=""/>
+      <w:lvlJc w:val="left"/>
+      <w:pPr>
+        <w:tabs>
+          <w:tab w:val="num" w:pos="5760"/>
+        </w:tabs>
+        <w:ind w:left="5760" w:hanging="360"/>
+      </w:pPr>
+      <w:rPr>
+        <w:rFonts w:ascii="Wingdings" w:hAnsi="Wingdings" w:hint="default"/>
+        <w:sz w:val="20"/>
+      </w:rPr>
+    </w:lvl>
+    <w:lvl w:ilvl="8" w:tentative="1">
+      <w:start w:val="1"/>
+      <w:numFmt w:val="bullet"/>
+      <w:lvlText w:val=""/>
+      <w:lvlJc w:val="left"/>
+      <w:pPr>
+        <w:tabs>
+          <w:tab w:val="num" w:pos="6480"/>
+        </w:tabs>
+        <w:ind w:left="6480" w:hanging="360"/>
+      </w:pPr>
+      <w:rPr>
+        <w:rFonts w:ascii="Wingdings" w:hAnsi="Wingdings" w:hint="default"/>
+        <w:sz w:val="20"/>
+      </w:rPr>
+    </w:lvl>
+  </w:abstractNum>
+  <w:abstractNum w:abstractNumId="10" w15:restartNumberingAfterBreak="0">
     <w:nsid w:val="2FF8785B"/>
     <w:multiLevelType w:val="multilevel"/>
     <w:tmpl w:val="39D40608"/>
@@ -4238,7 +4804,7 @@
       </w:pPr>
     </w:lvl>
   </w:abstractNum>
-  <w:abstractNum w:abstractNumId="10" w15:restartNumberingAfterBreak="0">
+  <w:abstractNum w:abstractNumId="11" w15:restartNumberingAfterBreak="0">
     <w:nsid w:val="386B1369"/>
     <w:multiLevelType w:val="multilevel"/>
     <w:tmpl w:val="9C0ACA86"/>
@@ -4355,7 +4921,7 @@
       </w:pPr>
     </w:lvl>
   </w:abstractNum>
-  <w:abstractNum w:abstractNumId="11" w15:restartNumberingAfterBreak="0">
+  <w:abstractNum w:abstractNumId="12" w15:restartNumberingAfterBreak="0">
     <w:nsid w:val="39A36364"/>
     <w:multiLevelType w:val="multilevel"/>
     <w:tmpl w:val="5DE21B3A"/>
@@ -4472,7 +5038,7 @@
       </w:pPr>
     </w:lvl>
   </w:abstractNum>
-  <w:abstractNum w:abstractNumId="12" w15:restartNumberingAfterBreak="0">
+  <w:abstractNum w:abstractNumId="13" w15:restartNumberingAfterBreak="0">
     <w:nsid w:val="3B2B0F69"/>
     <w:multiLevelType w:val="hybridMultilevel"/>
     <w:tmpl w:val="7DD0F788"/>
@@ -4561,7 +5127,7 @@
       </w:pPr>
     </w:lvl>
   </w:abstractNum>
-  <w:abstractNum w:abstractNumId="13" w15:restartNumberingAfterBreak="0">
+  <w:abstractNum w:abstractNumId="14" w15:restartNumberingAfterBreak="0">
     <w:nsid w:val="3D5537E3"/>
     <w:multiLevelType w:val="hybridMultilevel"/>
     <w:tmpl w:val="EAE8817E"/>
@@ -4650,7 +5216,7 @@
       </w:pPr>
     </w:lvl>
   </w:abstractNum>
-  <w:abstractNum w:abstractNumId="14" w15:restartNumberingAfterBreak="0">
+  <w:abstractNum w:abstractNumId="15" w15:restartNumberingAfterBreak="0">
     <w:nsid w:val="40111D34"/>
     <w:multiLevelType w:val="hybridMultilevel"/>
     <w:tmpl w:val="223CE4C4"/>
@@ -4739,7 +5305,7 @@
       </w:pPr>
     </w:lvl>
   </w:abstractNum>
-  <w:abstractNum w:abstractNumId="15" w15:restartNumberingAfterBreak="0">
+  <w:abstractNum w:abstractNumId="16" w15:restartNumberingAfterBreak="0">
     <w:nsid w:val="417B543C"/>
     <w:multiLevelType w:val="hybridMultilevel"/>
     <w:tmpl w:val="A2D66CA8"/>
@@ -4828,7 +5394,7 @@
       </w:pPr>
     </w:lvl>
   </w:abstractNum>
-  <w:abstractNum w:abstractNumId="16" w15:restartNumberingAfterBreak="0">
+  <w:abstractNum w:abstractNumId="17" w15:restartNumberingAfterBreak="0">
     <w:nsid w:val="47F375DB"/>
     <w:multiLevelType w:val="multilevel"/>
     <w:tmpl w:val="2A4AB148"/>
@@ -4945,7 +5511,7 @@
       </w:pPr>
     </w:lvl>
   </w:abstractNum>
-  <w:abstractNum w:abstractNumId="17" w15:restartNumberingAfterBreak="0">
+  <w:abstractNum w:abstractNumId="18" w15:restartNumberingAfterBreak="0">
     <w:nsid w:val="4E3F0AEE"/>
     <w:multiLevelType w:val="hybridMultilevel"/>
     <w:tmpl w:val="B9F0B3BE"/>
@@ -5034,7 +5600,7 @@
       </w:pPr>
     </w:lvl>
   </w:abstractNum>
-  <w:abstractNum w:abstractNumId="18" w15:restartNumberingAfterBreak="0">
+  <w:abstractNum w:abstractNumId="19" w15:restartNumberingAfterBreak="0">
     <w:nsid w:val="51487EF2"/>
     <w:multiLevelType w:val="multilevel"/>
     <w:tmpl w:val="AF38A146"/>
@@ -5151,7 +5717,7 @@
       </w:pPr>
     </w:lvl>
   </w:abstractNum>
-  <w:abstractNum w:abstractNumId="19" w15:restartNumberingAfterBreak="0">
+  <w:abstractNum w:abstractNumId="20" w15:restartNumberingAfterBreak="0">
     <w:nsid w:val="53ED6BFB"/>
     <w:multiLevelType w:val="hybridMultilevel"/>
     <w:tmpl w:val="7E502E8C"/>
@@ -5240,7 +5806,97 @@
       </w:pPr>
     </w:lvl>
   </w:abstractNum>
-  <w:abstractNum w:abstractNumId="20" w15:restartNumberingAfterBreak="0">
+  <w:abstractNum w:abstractNumId="21" w15:restartNumberingAfterBreak="0">
+    <w:nsid w:val="544F2EF2"/>
+    <w:multiLevelType w:val="hybridMultilevel"/>
+    <w:tmpl w:val="507899E8"/>
+    <w:lvl w:ilvl="0" w:tplc="E1D68DBE">
+      <w:start w:val="1"/>
+      <w:numFmt w:val="decimal"/>
+      <w:lvlText w:val="%1."/>
+      <w:lvlJc w:val="left"/>
+      <w:pPr>
+        <w:ind w:left="1080" w:hanging="360"/>
+      </w:pPr>
+      <w:rPr>
+        <w:rFonts w:hint="default"/>
+        <w:color w:val="EE0000"/>
+      </w:rPr>
+    </w:lvl>
+    <w:lvl w:ilvl="1" w:tplc="34090019" w:tentative="1">
+      <w:start w:val="1"/>
+      <w:numFmt w:val="lowerLetter"/>
+      <w:lvlText w:val="%2."/>
+      <w:lvlJc w:val="left"/>
+      <w:pPr>
+        <w:ind w:left="1800" w:hanging="360"/>
+      </w:pPr>
+    </w:lvl>
+    <w:lvl w:ilvl="2" w:tplc="3409001B" w:tentative="1">
+      <w:start w:val="1"/>
+      <w:numFmt w:val="lowerRoman"/>
+      <w:lvlText w:val="%3."/>
+      <w:lvlJc w:val="right"/>
+      <w:pPr>
+        <w:ind w:left="2520" w:hanging="180"/>
+      </w:pPr>
+    </w:lvl>
+    <w:lvl w:ilvl="3" w:tplc="3409000F" w:tentative="1">
+      <w:start w:val="1"/>
+      <w:numFmt w:val="decimal"/>
+      <w:lvlText w:val="%4."/>
+      <w:lvlJc w:val="left"/>
+      <w:pPr>
+        <w:ind w:left="3240" w:hanging="360"/>
+      </w:pPr>
+    </w:lvl>
+    <w:lvl w:ilvl="4" w:tplc="34090019" w:tentative="1">
+      <w:start w:val="1"/>
+      <w:numFmt w:val="lowerLetter"/>
+      <w:lvlText w:val="%5."/>
+      <w:lvlJc w:val="left"/>
+      <w:pPr>
+        <w:ind w:left="3960" w:hanging="360"/>
+      </w:pPr>
+    </w:lvl>
+    <w:lvl w:ilvl="5" w:tplc="3409001B" w:tentative="1">
+      <w:start w:val="1"/>
+      <w:numFmt w:val="lowerRoman"/>
+      <w:lvlText w:val="%6."/>
+      <w:lvlJc w:val="right"/>
+      <w:pPr>
+        <w:ind w:left="4680" w:hanging="180"/>
+      </w:pPr>
+    </w:lvl>
+    <w:lvl w:ilvl="6" w:tplc="3409000F" w:tentative="1">
+      <w:start w:val="1"/>
+      <w:numFmt w:val="decimal"/>
+      <w:lvlText w:val="%7."/>
+      <w:lvlJc w:val="left"/>
+      <w:pPr>
+        <w:ind w:left="5400" w:hanging="360"/>
+      </w:pPr>
+    </w:lvl>
+    <w:lvl w:ilvl="7" w:tplc="34090019" w:tentative="1">
+      <w:start w:val="1"/>
+      <w:numFmt w:val="lowerLetter"/>
+      <w:lvlText w:val="%8."/>
+      <w:lvlJc w:val="left"/>
+      <w:pPr>
+        <w:ind w:left="6120" w:hanging="360"/>
+      </w:pPr>
+    </w:lvl>
+    <w:lvl w:ilvl="8" w:tplc="3409001B" w:tentative="1">
+      <w:start w:val="1"/>
+      <w:numFmt w:val="lowerRoman"/>
+      <w:lvlText w:val="%9."/>
+      <w:lvlJc w:val="right"/>
+      <w:pPr>
+        <w:ind w:left="6840" w:hanging="180"/>
+      </w:pPr>
+    </w:lvl>
+  </w:abstractNum>
+  <w:abstractNum w:abstractNumId="22" w15:restartNumberingAfterBreak="0">
     <w:nsid w:val="5DF30ADB"/>
     <w:multiLevelType w:val="hybridMultilevel"/>
     <w:tmpl w:val="6C346014"/>
@@ -5329,7 +5985,7 @@
       </w:pPr>
     </w:lvl>
   </w:abstractNum>
-  <w:abstractNum w:abstractNumId="21" w15:restartNumberingAfterBreak="0">
+  <w:abstractNum w:abstractNumId="23" w15:restartNumberingAfterBreak="0">
     <w:nsid w:val="62260D3C"/>
     <w:multiLevelType w:val="multilevel"/>
     <w:tmpl w:val="E9667BAC"/>
@@ -5446,7 +6102,7 @@
       </w:pPr>
     </w:lvl>
   </w:abstractNum>
-  <w:abstractNum w:abstractNumId="22" w15:restartNumberingAfterBreak="0">
+  <w:abstractNum w:abstractNumId="24" w15:restartNumberingAfterBreak="0">
     <w:nsid w:val="627B5271"/>
     <w:multiLevelType w:val="hybridMultilevel"/>
     <w:tmpl w:val="F2C4EA32"/>
@@ -5535,7 +6191,7 @@
       </w:pPr>
     </w:lvl>
   </w:abstractNum>
-  <w:abstractNum w:abstractNumId="23" w15:restartNumberingAfterBreak="0">
+  <w:abstractNum w:abstractNumId="25" w15:restartNumberingAfterBreak="0">
     <w:nsid w:val="65540B44"/>
     <w:multiLevelType w:val="hybridMultilevel"/>
     <w:tmpl w:val="40C4F6E4"/>
@@ -5624,7 +6280,7 @@
       </w:pPr>
     </w:lvl>
   </w:abstractNum>
-  <w:abstractNum w:abstractNumId="24" w15:restartNumberingAfterBreak="0">
+  <w:abstractNum w:abstractNumId="26" w15:restartNumberingAfterBreak="0">
     <w:nsid w:val="6CAE1BB1"/>
     <w:multiLevelType w:val="multilevel"/>
     <w:tmpl w:val="1DF6AEE8"/>
@@ -5741,7 +6397,7 @@
       </w:pPr>
     </w:lvl>
   </w:abstractNum>
-  <w:abstractNum w:abstractNumId="25" w15:restartNumberingAfterBreak="0">
+  <w:abstractNum w:abstractNumId="27" w15:restartNumberingAfterBreak="0">
     <w:nsid w:val="79713BB1"/>
     <w:multiLevelType w:val="multilevel"/>
     <w:tmpl w:val="7C80DFA2"/>
@@ -5858,7 +6514,7 @@
       </w:pPr>
     </w:lvl>
   </w:abstractNum>
-  <w:abstractNum w:abstractNumId="26" w15:restartNumberingAfterBreak="0">
+  <w:abstractNum w:abstractNumId="28" w15:restartNumberingAfterBreak="0">
     <w:nsid w:val="7E294865"/>
     <w:multiLevelType w:val="hybridMultilevel"/>
     <w:tmpl w:val="9BB4D872"/>
@@ -5951,31 +6607,31 @@
     <w:abstractNumId w:val="8"/>
   </w:num>
   <w:num w:numId="2" w16cid:durableId="1507283324">
-    <w:abstractNumId w:val="20"/>
+    <w:abstractNumId w:val="22"/>
   </w:num>
   <w:num w:numId="3" w16cid:durableId="1632704925">
-    <w:abstractNumId w:val="19"/>
+    <w:abstractNumId w:val="20"/>
   </w:num>
   <w:num w:numId="4" w16cid:durableId="1180773277">
     <w:abstractNumId w:val="0"/>
   </w:num>
   <w:num w:numId="5" w16cid:durableId="1910843721">
-    <w:abstractNumId w:val="14"/>
+    <w:abstractNumId w:val="15"/>
   </w:num>
   <w:num w:numId="6" w16cid:durableId="1886136868">
     <w:abstractNumId w:val="2"/>
   </w:num>
   <w:num w:numId="7" w16cid:durableId="1122651082">
-    <w:abstractNumId w:val="15"/>
+    <w:abstractNumId w:val="16"/>
   </w:num>
   <w:num w:numId="8" w16cid:durableId="1302732831">
-    <w:abstractNumId w:val="13"/>
+    <w:abstractNumId w:val="14"/>
   </w:num>
   <w:num w:numId="9" w16cid:durableId="1226454271">
-    <w:abstractNumId w:val="26"/>
+    <w:abstractNumId w:val="28"/>
   </w:num>
   <w:num w:numId="10" w16cid:durableId="262152733">
-    <w:abstractNumId w:val="17"/>
+    <w:abstractNumId w:val="18"/>
   </w:num>
   <w:num w:numId="11" w16cid:durableId="450132885">
     <w:abstractNumId w:val="7"/>
@@ -5984,40 +6640,40 @@
     <w:abstractNumId w:val="1"/>
   </w:num>
   <w:num w:numId="13" w16cid:durableId="2063478974">
-    <w:abstractNumId w:val="23"/>
+    <w:abstractNumId w:val="25"/>
   </w:num>
   <w:num w:numId="14" w16cid:durableId="1472094567">
-    <w:abstractNumId w:val="22"/>
+    <w:abstractNumId w:val="24"/>
   </w:num>
   <w:num w:numId="15" w16cid:durableId="1521702895">
+    <w:abstractNumId w:val="13"/>
+  </w:num>
+  <w:num w:numId="16" w16cid:durableId="1238632438">
+    <w:abstractNumId w:val="17"/>
+  </w:num>
+  <w:num w:numId="17" w16cid:durableId="105389829">
+    <w:abstractNumId w:val="11"/>
+  </w:num>
+  <w:num w:numId="18" w16cid:durableId="2056198681">
     <w:abstractNumId w:val="12"/>
   </w:num>
-  <w:num w:numId="16" w16cid:durableId="1238632438">
-    <w:abstractNumId w:val="16"/>
-  </w:num>
-  <w:num w:numId="17" w16cid:durableId="105389829">
-    <w:abstractNumId w:val="10"/>
-  </w:num>
-  <w:num w:numId="18" w16cid:durableId="2056198681">
-    <w:abstractNumId w:val="11"/>
-  </w:num>
   <w:num w:numId="19" w16cid:durableId="1117287258">
-    <w:abstractNumId w:val="18"/>
+    <w:abstractNumId w:val="19"/>
   </w:num>
   <w:num w:numId="20" w16cid:durableId="459303076">
     <w:abstractNumId w:val="3"/>
   </w:num>
   <w:num w:numId="21" w16cid:durableId="997147033">
-    <w:abstractNumId w:val="24"/>
+    <w:abstractNumId w:val="26"/>
   </w:num>
   <w:num w:numId="22" w16cid:durableId="2043550398">
-    <w:abstractNumId w:val="21"/>
+    <w:abstractNumId w:val="23"/>
   </w:num>
   <w:num w:numId="23" w16cid:durableId="1372270492">
-    <w:abstractNumId w:val="9"/>
+    <w:abstractNumId w:val="10"/>
   </w:num>
   <w:num w:numId="24" w16cid:durableId="1826386037">
-    <w:abstractNumId w:val="25"/>
+    <w:abstractNumId w:val="27"/>
   </w:num>
   <w:num w:numId="25" w16cid:durableId="1501853138">
     <w:abstractNumId w:val="6"/>
@@ -6027,6 +6683,12 @@
   </w:num>
   <w:num w:numId="27" w16cid:durableId="1096636378">
     <w:abstractNumId w:val="5"/>
+  </w:num>
+  <w:num w:numId="28" w16cid:durableId="1500999452">
+    <w:abstractNumId w:val="9"/>
+  </w:num>
+  <w:num w:numId="29" w16cid:durableId="2586691">
+    <w:abstractNumId w:val="21"/>
   </w:num>
 </w:numbering>
 </file>
@@ -7275,8 +7937,28 @@
 </file>
 
 <file path=customXml/item1.xml><?xml version="1.0" encoding="utf-8"?>
-<ct:contentTypeSchema xmlns:ct="http://schemas.microsoft.com/office/2006/metadata/contentType" xmlns:ma="http://schemas.microsoft.com/office/2006/metadata/properties/metaAttributes" ct:_="" ma:_="" ma:contentTypeName="Document" ma:contentTypeID="0x010100329F44070538E343B256F890D2D6797B" ma:contentTypeVersion="10" ma:contentTypeDescription="Create a new document." ma:contentTypeScope="" ma:versionID="2c015e2ea05bd99689c48b3fa9da3590">
-  <xsd:schema xmlns:xsd="http://www.w3.org/2001/XMLSchema" xmlns:xs="http://www.w3.org/2001/XMLSchema" xmlns:p="http://schemas.microsoft.com/office/2006/metadata/properties" xmlns:ns2="280aaeff-5fb1-4850-aa74-a111345bcccd" xmlns:ns3="b265089a-e2ae-4a0b-8ad8-6129d8d1e8ac" targetNamespace="http://schemas.microsoft.com/office/2006/metadata/properties" ma:root="true" ma:fieldsID="c22ebce3b186a556745d8b457fce3307" ns2:_="" ns3:_="">
+<p:properties xmlns:p="http://schemas.microsoft.com/office/2006/metadata/properties" xmlns:xsi="http://www.w3.org/2001/XMLSchema-instance" xmlns:pc="http://schemas.microsoft.com/office/infopath/2007/PartnerControls">
+  <documentManagement>
+    <TaxCatchAll xmlns="b265089a-e2ae-4a0b-8ad8-6129d8d1e8ac" xsi:nil="true"/>
+    <lcf76f155ced4ddcb4097134ff3c332f xmlns="280aaeff-5fb1-4850-aa74-a111345bcccd">
+      <Terms xmlns="http://schemas.microsoft.com/office/infopath/2007/PartnerControls"/>
+    </lcf76f155ced4ddcb4097134ff3c332f>
+  </documentManagement>
+</p:properties>
+</file>
+
+<file path=customXml/item2.xml><?xml version="1.0" encoding="utf-8"?>
+<?mso-contentType ?>
+<FormTemplates xmlns="http://schemas.microsoft.com/sharepoint/v3/contenttype/forms">
+  <Display>DocumentLibraryForm</Display>
+  <Edit>DocumentLibraryForm</Edit>
+  <New>DocumentLibraryForm</New>
+</FormTemplates>
+</file>
+
+<file path=customXml/item3.xml><?xml version="1.0" encoding="utf-8"?>
+<ct:contentTypeSchema xmlns:ct="http://schemas.microsoft.com/office/2006/metadata/contentType" xmlns:ma="http://schemas.microsoft.com/office/2006/metadata/properties/metaAttributes" ct:_="" ma:_="" ma:contentTypeName="Document" ma:contentTypeID="0x010100329F44070538E343B256F890D2D6797B" ma:contentTypeVersion="10" ma:contentTypeDescription="Create a new document." ma:contentTypeScope="" ma:versionID="68a9c0290032ea14b0bb13258653ef75">
+  <xsd:schema xmlns:xsd="http://www.w3.org/2001/XMLSchema" xmlns:xs="http://www.w3.org/2001/XMLSchema" xmlns:p="http://schemas.microsoft.com/office/2006/metadata/properties" xmlns:ns2="280aaeff-5fb1-4850-aa74-a111345bcccd" xmlns:ns3="b265089a-e2ae-4a0b-8ad8-6129d8d1e8ac" targetNamespace="http://schemas.microsoft.com/office/2006/metadata/properties" ma:root="true" ma:fieldsID="5ff8c9b995789ae58b5d5a1859cf30ea" ns2:_="" ns3:_="">
     <xsd:import namespace="280aaeff-5fb1-4850-aa74-a111345bcccd"/>
     <xsd:import namespace="b265089a-e2ae-4a0b-8ad8-6129d8d1e8ac"/>
     <xsd:element name="properties">
@@ -7463,41 +8145,19 @@
 </ct:contentTypeSchema>
 </file>
 
-<file path=customXml/item2.xml><?xml version="1.0" encoding="utf-8"?>
-<?mso-contentType ?>
-<FormTemplates xmlns="http://schemas.microsoft.com/sharepoint/v3/contenttype/forms">
-  <Display>DocumentLibraryForm</Display>
-  <Edit>DocumentLibraryForm</Edit>
-  <New>DocumentLibraryForm</New>
-</FormTemplates>
-</file>
-
-<file path=customXml/item3.xml><?xml version="1.0" encoding="utf-8"?>
-<p:properties xmlns:p="http://schemas.microsoft.com/office/2006/metadata/properties" xmlns:xsi="http://www.w3.org/2001/XMLSchema-instance" xmlns:pc="http://schemas.microsoft.com/office/infopath/2007/PartnerControls">
-  <documentManagement>
-    <TaxCatchAll xmlns="b265089a-e2ae-4a0b-8ad8-6129d8d1e8ac" xsi:nil="true"/>
-    <lcf76f155ced4ddcb4097134ff3c332f xmlns="280aaeff-5fb1-4850-aa74-a111345bcccd">
-      <Terms xmlns="http://schemas.microsoft.com/office/infopath/2007/PartnerControls"/>
-    </lcf76f155ced4ddcb4097134ff3c332f>
-  </documentManagement>
-</p:properties>
-</file>
-
 <file path=customXml/itemProps1.xml><?xml version="1.0" encoding="utf-8"?>
-<ds:datastoreItem xmlns:ds="http://schemas.openxmlformats.org/officeDocument/2006/customXml" ds:itemID="{A9778E7F-E06C-4733-B783-928CC38AC0EA}">
+<ds:datastoreItem xmlns:ds="http://schemas.openxmlformats.org/officeDocument/2006/customXml" ds:itemID="{81F006B8-213A-4420-B4A4-5B6054435CFF}">
   <ds:schemaRefs>
-    <ds:schemaRef ds:uri="http://schemas.microsoft.com/office/2006/metadata/contentType"/>
-    <ds:schemaRef ds:uri="http://schemas.microsoft.com/office/2006/metadata/properties/metaAttributes"/>
-    <ds:schemaRef ds:uri="http://www.w3.org/2001/XMLSchema"/>
+    <ds:schemaRef ds:uri="http://purl.org/dc/terms/"/>
+    <ds:schemaRef ds:uri="280aaeff-5fb1-4850-aa74-a111345bcccd"/>
+    <ds:schemaRef ds:uri="http://schemas.microsoft.com/office/infopath/2007/PartnerControls"/>
+    <ds:schemaRef ds:uri="http://purl.org/dc/elements/1.1/"/>
+    <ds:schemaRef ds:uri="http://purl.org/dc/dcmitype/"/>
+    <ds:schemaRef ds:uri="http://schemas.microsoft.com/office/2006/documentManagement/types"/>
+    <ds:schemaRef ds:uri="b265089a-e2ae-4a0b-8ad8-6129d8d1e8ac"/>
+    <ds:schemaRef ds:uri="http://www.w3.org/XML/1998/namespace"/>
+    <ds:schemaRef ds:uri="http://schemas.openxmlformats.org/package/2006/metadata/core-properties"/>
     <ds:schemaRef ds:uri="http://schemas.microsoft.com/office/2006/metadata/properties"/>
-    <ds:schemaRef ds:uri="280aaeff-5fb1-4850-aa74-a111345bcccd"/>
-    <ds:schemaRef ds:uri="b265089a-e2ae-4a0b-8ad8-6129d8d1e8ac"/>
-    <ds:schemaRef ds:uri="http://schemas.microsoft.com/office/2006/documentManagement/types"/>
-    <ds:schemaRef ds:uri="http://schemas.microsoft.com/office/infopath/2007/PartnerControls"/>
-    <ds:schemaRef ds:uri="http://schemas.openxmlformats.org/package/2006/metadata/core-properties"/>
-    <ds:schemaRef ds:uri="http://purl.org/dc/elements/1.1/"/>
-    <ds:schemaRef ds:uri="http://purl.org/dc/terms/"/>
-    <ds:schemaRef ds:uri="http://schemas.microsoft.com/internal/obd"/>
   </ds:schemaRefs>
 </ds:datastoreItem>
 </file>
@@ -7511,12 +8171,5 @@
 </file>
 
 <file path=customXml/itemProps3.xml><?xml version="1.0" encoding="utf-8"?>
-<ds:datastoreItem xmlns:ds="http://schemas.openxmlformats.org/officeDocument/2006/customXml" ds:itemID="{81F006B8-213A-4420-B4A4-5B6054435CFF}">
-  <ds:schemaRefs>
-    <ds:schemaRef ds:uri="http://schemas.microsoft.com/office/2006/metadata/properties"/>
-    <ds:schemaRef ds:uri="http://schemas.microsoft.com/office/infopath/2007/PartnerControls"/>
-    <ds:schemaRef ds:uri="b265089a-e2ae-4a0b-8ad8-6129d8d1e8ac"/>
-    <ds:schemaRef ds:uri="280aaeff-5fb1-4850-aa74-a111345bcccd"/>
-  </ds:schemaRefs>
-</ds:datastoreItem>
+<ds:datastoreItem xmlns:ds="http://schemas.openxmlformats.org/officeDocument/2006/customXml" ds:itemID="{FEA9FB33-E4AC-4FF4-B5C0-EADA306926EE}"/>
 </file>
</xml_diff>

<commit_message>
enhanced query_decomposer and personal data retrieval
</commit_message>
<xml_diff>
--- a/data/hr_docs/NPAX_POLICIES.docx
+++ b/data/hr_docs/NPAX_POLICIES.docx
@@ -854,21 +854,7 @@
         <w:rPr>
           <w:color w:val="EE0000"/>
         </w:rPr>
-        <w:t xml:space="preserve">Generally, at least 1 business day notice is </w:t>
-      </w:r>
-      <w:proofErr w:type="gramStart"/>
-      <w:r>
-        <w:rPr>
-          <w:color w:val="EE0000"/>
-        </w:rPr>
-        <w:t>required;</w:t>
-      </w:r>
-      <w:proofErr w:type="gramEnd"/>
-      <w:r>
-        <w:rPr>
-          <w:color w:val="EE0000"/>
-        </w:rPr>
-        <w:t xml:space="preserve"> check company policy.</w:t>
+        <w:t>Generally, at least 1 business day notice is required; check company policy.</w:t>
       </w:r>
     </w:p>
     <w:p>
@@ -1189,19 +1175,11 @@
           <w:color w:val="EE0000"/>
         </w:rPr>
       </w:pPr>
-      <w:proofErr w:type="gramStart"/>
-      <w:r>
-        <w:rPr>
-          <w:color w:val="EE0000"/>
-        </w:rPr>
-        <w:t>Typically</w:t>
-      </w:r>
-      <w:proofErr w:type="gramEnd"/>
-      <w:r>
-        <w:rPr>
-          <w:color w:val="EE0000"/>
-        </w:rPr>
-        <w:t xml:space="preserve"> no limit, but excessive requests may require supervisor approval.</w:t>
+      <w:r>
+        <w:rPr>
+          <w:color w:val="EE0000"/>
+        </w:rPr>
+        <w:t>Typically no limit, but excessive requests may require supervisor approval.</w:t>
       </w:r>
     </w:p>
     <w:p>
@@ -1484,19 +1462,11 @@
           <w:color w:val="EE0000"/>
         </w:rPr>
       </w:pPr>
-      <w:proofErr w:type="gramStart"/>
-      <w:r>
-        <w:rPr>
-          <w:color w:val="EE0000"/>
-        </w:rPr>
-        <w:t>Typically</w:t>
-      </w:r>
-      <w:proofErr w:type="gramEnd"/>
-      <w:r>
-        <w:rPr>
-          <w:color w:val="EE0000"/>
-        </w:rPr>
-        <w:t xml:space="preserve"> 5 days per year; refer to company policy.</w:t>
+      <w:r>
+        <w:rPr>
+          <w:color w:val="EE0000"/>
+        </w:rPr>
+        <w:t>Typically 5 days per year; refer to company policy.</w:t>
       </w:r>
     </w:p>
     <w:p>
@@ -1871,19 +1841,11 @@
           <w:color w:val="EE0000"/>
         </w:rPr>
       </w:pPr>
-      <w:proofErr w:type="gramStart"/>
-      <w:r>
-        <w:rPr>
-          <w:color w:val="EE0000"/>
-        </w:rPr>
-        <w:t>Typically</w:t>
-      </w:r>
-      <w:proofErr w:type="gramEnd"/>
-      <w:r>
-        <w:rPr>
-          <w:color w:val="EE0000"/>
-        </w:rPr>
-        <w:t xml:space="preserve"> not, unless it’s part of a larger emergency.</w:t>
+      <w:r>
+        <w:rPr>
+          <w:color w:val="EE0000"/>
+        </w:rPr>
+        <w:t>Typically not, unless it’s part of a larger emergency.</w:t>
       </w:r>
     </w:p>
     <w:p>
@@ -2546,22 +2508,10 @@
           <w:b/>
           <w:bCs/>
         </w:rPr>
-        <w:t>every 15th and 30th/</w:t>
-      </w:r>
-      <w:proofErr w:type="gramStart"/>
-      <w:r>
-        <w:rPr>
-          <w:b/>
-          <w:bCs/>
-        </w:rPr>
-        <w:t>31st</w:t>
-      </w:r>
-      <w:r>
-        <w:t>, or</w:t>
-      </w:r>
-      <w:proofErr w:type="gramEnd"/>
-      <w:r>
-        <w:t xml:space="preserve"> based on the company payroll calendar.</w:t>
+        <w:t>every 15th and 30th/31st</w:t>
+      </w:r>
+      <w:r>
+        <w:t>, or based on the company payroll calendar.</w:t>
       </w:r>
     </w:p>
     <w:p>
@@ -2920,8 +2870,6 @@
       </w:r>
       <w:r>
         <w:br/>
-      </w:r>
-      <w:r>
         <w:t xml:space="preserve">Ans: </w:t>
       </w:r>
       <w:r>
@@ -3239,8 +3187,6 @@
       </w:r>
       <w:r>
         <w:br/>
-      </w:r>
-      <w:r>
         <w:t xml:space="preserve">Ans: </w:t>
       </w:r>
       <w:r>
@@ -3270,8 +3216,6 @@
       </w:r>
       <w:r>
         <w:br/>
-      </w:r>
-      <w:r>
         <w:t xml:space="preserve">Ans: </w:t>
       </w:r>
       <w:r>
@@ -3282,7 +3226,14 @@
           <w:b/>
           <w:bCs/>
         </w:rPr>
-        <w:t>8 hours per day</w:t>
+        <w:t>9</w:t>
+      </w:r>
+      <w:r>
+        <w:rPr>
+          <w:b/>
+          <w:bCs/>
+        </w:rPr>
+        <w:t xml:space="preserve"> hours per day</w:t>
       </w:r>
       <w:r>
         <w:t xml:space="preserve">, not including breaks. A </w:t>
@@ -3312,8 +3263,6 @@
       </w:r>
       <w:r>
         <w:br/>
-      </w:r>
-      <w:r>
         <w:t xml:space="preserve">Ans: </w:t>
       </w:r>
       <w:r>
@@ -3343,8 +3292,6 @@
       </w:r>
       <w:r>
         <w:br/>
-      </w:r>
-      <w:r>
         <w:t xml:space="preserve">Ans: </w:t>
       </w:r>
       <w:r>
@@ -7937,26 +7884,6 @@
 </file>
 
 <file path=customXml/item1.xml><?xml version="1.0" encoding="utf-8"?>
-<p:properties xmlns:p="http://schemas.microsoft.com/office/2006/metadata/properties" xmlns:xsi="http://www.w3.org/2001/XMLSchema-instance" xmlns:pc="http://schemas.microsoft.com/office/infopath/2007/PartnerControls">
-  <documentManagement>
-    <TaxCatchAll xmlns="b265089a-e2ae-4a0b-8ad8-6129d8d1e8ac" xsi:nil="true"/>
-    <lcf76f155ced4ddcb4097134ff3c332f xmlns="280aaeff-5fb1-4850-aa74-a111345bcccd">
-      <Terms xmlns="http://schemas.microsoft.com/office/infopath/2007/PartnerControls"/>
-    </lcf76f155ced4ddcb4097134ff3c332f>
-  </documentManagement>
-</p:properties>
-</file>
-
-<file path=customXml/item2.xml><?xml version="1.0" encoding="utf-8"?>
-<?mso-contentType ?>
-<FormTemplates xmlns="http://schemas.microsoft.com/sharepoint/v3/contenttype/forms">
-  <Display>DocumentLibraryForm</Display>
-  <Edit>DocumentLibraryForm</Edit>
-  <New>DocumentLibraryForm</New>
-</FormTemplates>
-</file>
-
-<file path=customXml/item3.xml><?xml version="1.0" encoding="utf-8"?>
 <ct:contentTypeSchema xmlns:ct="http://schemas.microsoft.com/office/2006/metadata/contentType" xmlns:ma="http://schemas.microsoft.com/office/2006/metadata/properties/metaAttributes" ct:_="" ma:_="" ma:contentTypeName="Document" ma:contentTypeID="0x010100329F44070538E343B256F890D2D6797B" ma:contentTypeVersion="10" ma:contentTypeDescription="Create a new document." ma:contentTypeScope="" ma:versionID="68a9c0290032ea14b0bb13258653ef75">
   <xsd:schema xmlns:xsd="http://www.w3.org/2001/XMLSchema" xmlns:xs="http://www.w3.org/2001/XMLSchema" xmlns:p="http://schemas.microsoft.com/office/2006/metadata/properties" xmlns:ns2="280aaeff-5fb1-4850-aa74-a111345bcccd" xmlns:ns3="b265089a-e2ae-4a0b-8ad8-6129d8d1e8ac" targetNamespace="http://schemas.microsoft.com/office/2006/metadata/properties" ma:root="true" ma:fieldsID="5ff8c9b995789ae58b5d5a1859cf30ea" ns2:_="" ns3:_="">
     <xsd:import namespace="280aaeff-5fb1-4850-aa74-a111345bcccd"/>
@@ -8145,19 +8072,41 @@
 </ct:contentTypeSchema>
 </file>
 
+<file path=customXml/item2.xml><?xml version="1.0" encoding="utf-8"?>
+<?mso-contentType ?>
+<FormTemplates xmlns="http://schemas.microsoft.com/sharepoint/v3/contenttype/forms">
+  <Display>DocumentLibraryForm</Display>
+  <Edit>DocumentLibraryForm</Edit>
+  <New>DocumentLibraryForm</New>
+</FormTemplates>
+</file>
+
+<file path=customXml/item3.xml><?xml version="1.0" encoding="utf-8"?>
+<p:properties xmlns:p="http://schemas.microsoft.com/office/2006/metadata/properties" xmlns:xsi="http://www.w3.org/2001/XMLSchema-instance" xmlns:pc="http://schemas.microsoft.com/office/infopath/2007/PartnerControls">
+  <documentManagement>
+    <TaxCatchAll xmlns="b265089a-e2ae-4a0b-8ad8-6129d8d1e8ac" xsi:nil="true"/>
+    <lcf76f155ced4ddcb4097134ff3c332f xmlns="280aaeff-5fb1-4850-aa74-a111345bcccd">
+      <Terms xmlns="http://schemas.microsoft.com/office/infopath/2007/PartnerControls"/>
+    </lcf76f155ced4ddcb4097134ff3c332f>
+  </documentManagement>
+</p:properties>
+</file>
+
 <file path=customXml/itemProps1.xml><?xml version="1.0" encoding="utf-8"?>
-<ds:datastoreItem xmlns:ds="http://schemas.openxmlformats.org/officeDocument/2006/customXml" ds:itemID="{81F006B8-213A-4420-B4A4-5B6054435CFF}">
+<ds:datastoreItem xmlns:ds="http://schemas.openxmlformats.org/officeDocument/2006/customXml" ds:itemID="{FEA9FB33-E4AC-4FF4-B5C0-EADA306926EE}">
   <ds:schemaRefs>
+    <ds:schemaRef ds:uri="http://schemas.microsoft.com/office/2006/metadata/contentType"/>
+    <ds:schemaRef ds:uri="http://schemas.microsoft.com/office/2006/metadata/properties/metaAttributes"/>
+    <ds:schemaRef ds:uri="http://www.w3.org/2001/XMLSchema"/>
+    <ds:schemaRef ds:uri="http://schemas.microsoft.com/office/2006/metadata/properties"/>
+    <ds:schemaRef ds:uri="280aaeff-5fb1-4850-aa74-a111345bcccd"/>
+    <ds:schemaRef ds:uri="b265089a-e2ae-4a0b-8ad8-6129d8d1e8ac"/>
+    <ds:schemaRef ds:uri="http://schemas.microsoft.com/office/2006/documentManagement/types"/>
+    <ds:schemaRef ds:uri="http://schemas.microsoft.com/office/infopath/2007/PartnerControls"/>
+    <ds:schemaRef ds:uri="http://schemas.openxmlformats.org/package/2006/metadata/core-properties"/>
+    <ds:schemaRef ds:uri="http://purl.org/dc/elements/1.1/"/>
     <ds:schemaRef ds:uri="http://purl.org/dc/terms/"/>
-    <ds:schemaRef ds:uri="280aaeff-5fb1-4850-aa74-a111345bcccd"/>
-    <ds:schemaRef ds:uri="http://schemas.microsoft.com/office/infopath/2007/PartnerControls"/>
-    <ds:schemaRef ds:uri="http://purl.org/dc/elements/1.1/"/>
-    <ds:schemaRef ds:uri="http://purl.org/dc/dcmitype/"/>
-    <ds:schemaRef ds:uri="http://schemas.microsoft.com/office/2006/documentManagement/types"/>
-    <ds:schemaRef ds:uri="b265089a-e2ae-4a0b-8ad8-6129d8d1e8ac"/>
-    <ds:schemaRef ds:uri="http://www.w3.org/XML/1998/namespace"/>
-    <ds:schemaRef ds:uri="http://schemas.openxmlformats.org/package/2006/metadata/core-properties"/>
-    <ds:schemaRef ds:uri="http://schemas.microsoft.com/office/2006/metadata/properties"/>
+    <ds:schemaRef ds:uri="http://schemas.microsoft.com/internal/obd"/>
   </ds:schemaRefs>
 </ds:datastoreItem>
 </file>
@@ -8171,5 +8120,12 @@
 </file>
 
 <file path=customXml/itemProps3.xml><?xml version="1.0" encoding="utf-8"?>
-<ds:datastoreItem xmlns:ds="http://schemas.openxmlformats.org/officeDocument/2006/customXml" ds:itemID="{FEA9FB33-E4AC-4FF4-B5C0-EADA306926EE}"/>
+<ds:datastoreItem xmlns:ds="http://schemas.openxmlformats.org/officeDocument/2006/customXml" ds:itemID="{81F006B8-213A-4420-B4A4-5B6054435CFF}">
+  <ds:schemaRefs>
+    <ds:schemaRef ds:uri="http://schemas.microsoft.com/office/2006/metadata/properties"/>
+    <ds:schemaRef ds:uri="http://schemas.microsoft.com/office/infopath/2007/PartnerControls"/>
+    <ds:schemaRef ds:uri="b265089a-e2ae-4a0b-8ad8-6129d8d1e8ac"/>
+    <ds:schemaRef ds:uri="280aaeff-5fb1-4850-aa74-a111345bcccd"/>
+  </ds:schemaRefs>
+</ds:datastoreItem>
 </file>
</xml_diff>